<commit_message>
Polish writing: remove AI-style expressions, improve clarity
- Simplify verbose phrases
- Remove template expressions
- Shorten outcome statements
- Align resume with website tone

Based on awesome-ai-research-writing guidelines.

Co-Authored-By: Claude Opus 4.5 <noreply@anthropic.com>
</commit_message>
<xml_diff>
--- a/docs/assets/resume/Bie_Xiaofeng_CV_2026.docx
+++ b/docs/assets/resume/Bie_Xiaofeng_CV_2026.docx
@@ -60,7 +60,7 @@
         <w:pStyle w:val="FirstParagraph"/>
       </w:pPr>
       <w:r>
-        <w:t xml:space="preserve">Technology and business builder with 14+ years spanning enterprise software architecture, product-R&amp;D coordination, and data-driven business transformation. Currently extending into AI system design and intelligent workflow architecture through formal study and hands-on project work.</w:t>
+        <w:t xml:space="preserve">Technology and business builder with 14+ years in enterprise software architecture, product-R&amp;D coordination, and data-driven business transformation. Now building deeper capability in AI system design and intelligent workflows through formal study and hands-on projects.</w:t>
       </w:r>
     </w:p>
     <w:p>
@@ -68,7 +68,7 @@
         <w:pStyle w:val="BodyText"/>
       </w:pPr>
       <w:r>
-        <w:t xml:space="preserve">I design AI and data products that connect business insight, engineering architecture, and scalable execution — not as separate disciplines, but as integrated delivery.</w:t>
+        <w:t xml:space="preserve">I design AI and data products that connect business insight, engineering architecture, and execution — as one integrated practice, not separate disciplines.</w:t>
       </w:r>
     </w:p>
     <w:p>
@@ -322,7 +322,7 @@
         <w:pStyle w:val="Compact"/>
       </w:pPr>
       <w:r>
-        <w:t xml:space="preserve">Led cross-functional initiatives in business transformation, digital solution design, and scalable enterprise systems</w:t>
+        <w:t xml:space="preserve">Led business transformation, digital solution design, and enterprise system projects across functions</w:t>
       </w:r>
     </w:p>
     <w:p>
@@ -334,7 +334,7 @@
         <w:pStyle w:val="Compact"/>
       </w:pPr>
       <w:r>
-        <w:t xml:space="preserve">Directed data-driven market analysis and trend insight work for strategic decision support</w:t>
+        <w:t xml:space="preserve">Ran data-driven market analysis and trend work for strategic decisions</w:t>
       </w:r>
     </w:p>
     <w:p>
@@ -358,7 +358,7 @@
         <w:pStyle w:val="Compact"/>
       </w:pPr>
       <w:r>
-        <w:t xml:space="preserve">Designed technical architecture and delivery governance for industry-facing client solutions</w:t>
+        <w:t xml:space="preserve">Designed technical architecture and delivery governance for client-facing solutions</w:t>
       </w:r>
     </w:p>
     <w:bookmarkEnd w:id="22"/>
@@ -519,7 +519,7 @@
         <w:pStyle w:val="Compact"/>
       </w:pPr>
       <w:r>
-        <w:t xml:space="preserve">Strengthening hands-on capability in machine learning, AI system design, and project-based analytical work</w:t>
+        <w:t xml:space="preserve">Building hands-on capability in machine learning, AI system design, and project-based analytical work</w:t>
       </w:r>
     </w:p>
     <w:p>

</xml_diff>